<commit_message>
Fix finite-horizon budget termination and align reports
</commit_message>
<xml_diff>
--- a/report/ME5418_Group18_Neural_Network_Report_Chinese.docx
+++ b/report/ME5418_Group18_Neural_Network_Report_Chinese.docx
@@ -55,8 +55,9 @@
       <w:r>
         <w:rPr>
           <w:rFonts w:eastAsia="宋体"/>
+          <w:color w:val="000000"/>
         </w:rPr>
-        <w:t>环境中的末端执行器被建模为圆形，需要穿过柔性树枝到达果实。动作空间包含八个动作：沿上、下、左、右四个方向移动，每个方向分别提供小步长和大步长。观测向量包含机器人位置、目标相对位置、树枝当前及静止状态的节点、刚度、接触标记、安全形变上限、树枝有效性掩码，以及剩余动作预算。奖励鼓励接近目标，并惩罚树枝形变和行程，同时设置成功奖励与损伤惩罚。每次运动会被拆分为多个子步，以检查接触和枝条线段应变。成功或损伤会使回合终止（termination）；达到步数上限则记为时间截断（truncation）。</w:t>
+        <w:t>环境中的末端执行器被建模为圆形，需要穿过柔性树枝到达果实。动作空间包含八个动作：沿上、下、左、右四个方向移动，每个方向分别提供小步长和大步长。观测向量包含机器人位置、目标相对位置、树枝当前及静止状态的节点、刚度、接触标记、安全形变上限、树枝有效性掩码，以及剩余动作预算。奖励鼓励接近目标，并惩罚树枝形变和行程，同时设置成功奖励与损伤惩罚。每次运动会被拆分为多个子步，以检查接触和枝条线段应变。成功、损伤或耗尽步数预算都会使任务终止（termination）；默认场景的预算为100步，混合树冠场景为200步。</w:t>
       </w:r>
     </w:p>
     <w:p>
@@ -643,7 +644,7 @@
           <w:rFonts w:eastAsia="宋体"/>
           <w:color w:val="000000"/>
         </w:rPr>
-        <w:t>默认设置下，演示程序固定随机种子，使用随机策略采集128条状态转移样本，然后以128为小批量大小执行三次更新。我们在重置回合之前保存最后一个下一状态观测，避免某条转移错误地关联到新回合的状态。在线网络预测样本中已执行动作的Q值。Bellman目标值由即时奖励与目标网络给出的下一状态最大Q值的折扣项相加得到，折扣因子为0.99。成功或损伤后不再使用下一状态价值进行自举估计（bootstrapping）；时间截断时则保留该项。 默认小批量的输入形状为128×125，网络输出128×8个Q值。随后通过gather操作选出各条样本中实际执行动作的预测值，用于计算损失。</w:t>
+        <w:t>默认设置下，演示程序固定随机种子，使用随机策略采集128条状态转移样本，然后以128为小批量大小执行三次更新。我们在重置回合之前保存最后一个下一状态观测，避免某条转移错误地关联到新回合的状态。在线网络预测样本中已执行动作的Q值。Bellman目标值由即时奖励与目标网络给出的下一状态最大Q值的折扣项相加得到，折扣因子为0.99。成功、损伤或预算耗尽后不再使用下一状态价值进行自举估计（bootstrapping）；只有任务尚未结束时的外部提前截断才保留该项。 默认小批量的输入形状为128×125，网络输出128×8个Q值。随后通过gather操作选出各条样本中实际执行动作的预测值，用于计算损失。</w:t>
       </w:r>
     </w:p>
     <w:p>
@@ -727,8 +728,9 @@
       <w:r>
         <w:rPr>
           <w:rFonts w:eastAsia="宋体"/>
+          <w:color w:val="000000"/>
         </w:rPr>
-        <w:t>将网络接入环境后，一个主要体会是需要明确数据接口。混合树冠场景需要341维输入，因此把网络输入固定为125维会导致运行失败。我们还需要区分任务终止与时间截断，并在重置之前保存最后一个观测。否则，某条状态转移可能错误地使用下一回合的状态。把HarvestingEnv.step拆分为动作处理、运动求解和状态转移评估等辅助函数后，这些逻辑也更容易检查。</w:t>
+        <w:t>将网络接入环境后，一个主要体会是需要明确数据接口。混合树冠场景需要341维输入，因此把网络输入固定为125维会导致运行失败。我们还需要把预算耗尽视为任务终止，与外部提前截断区分开，并在重置之前保存最后一个观测。否则，某条状态转移可能错误地使用下一回合的状态。把HarvestingEnv.step拆分为动作处理、运动求解和状态转移评估等辅助函数后，这些逻辑也更容易检查。</w:t>
       </w:r>
     </w:p>
     <w:p>

</xml_diff>